<commit_message>
fix(plantilla): FPJ-7 de vuelta a carta vertical
El usuario confirmo: FPJ-8 SI debe ir en horizontal (aprovechando toda
la pagina, respetando margenes -- ya asi desde el parche anterior),
pero FPJ-7 se imprime en vertical. Se revierte solo la orientacion
(8.5x11 in, portrait) y el escalado de anchos que se habia aplicado
para landscape -- se conserva intacta la correccion de las 21 casillas
del NUNC (2-3-2-5-4-5), que sigue siendo valida independientemente de
la orientacion de la pagina.

Verificado generando un documento de prueba real con el motor de
relleno de plantillas y datos de ejemplo: una sola pagina, todo el
contenido intacto.
</commit_message>
<xml_diff>
--- a/assets/documentos/fpj7-plantilla.docx
+++ b/assets/documentos/fpj7-plantilla.docx
@@ -84,7 +84,7 @@
     </w:p>
     <w:tbl>
       <w:tblPr>
-        <w:tblW w:type="dxa" w:w="4270"/>
+        <w:tblW w:type="dxa" w:w="3150"/>
         <w:jc w:val="right"/>
         <w:tblBorders>
           <w:top w:val="single" w:color="auto" w:sz="4"/>
@@ -96,21 +96,21 @@
         </w:tblBorders>
       </w:tblPr>
       <w:tblGrid>
-        <w:gridCol w:w="427"/>
-        <w:gridCol w:w="427"/>
-        <w:gridCol w:w="427"/>
-        <w:gridCol w:w="427"/>
-        <w:gridCol w:w="427"/>
-        <w:gridCol w:w="427"/>
-        <w:gridCol w:w="427"/>
-        <w:gridCol w:w="427"/>
-        <w:gridCol w:w="427"/>
-        <w:gridCol w:w="427"/>
+        <w:gridCol w:w="315"/>
+        <w:gridCol w:w="315"/>
+        <w:gridCol w:w="315"/>
+        <w:gridCol w:w="315"/>
+        <w:gridCol w:w="315"/>
+        <w:gridCol w:w="315"/>
+        <w:gridCol w:w="315"/>
+        <w:gridCol w:w="315"/>
+        <w:gridCol w:w="315"/>
+        <w:gridCol w:w="315"/>
       </w:tblGrid>
       <w:tr>
         <w:tc>
           <w:tcPr>
-            <w:tcW w:type="dxa" w:w="427"/>
+            <w:tcW w:type="dxa" w:w="315"/>
             <w:gridSpan w:val="1"/>
             <w:tcBorders>
               <w:top w:val="single" w:color="000000" w:sz="4"/>
@@ -145,7 +145,7 @@
         </w:tc>
         <w:tc>
           <w:tcPr>
-            <w:tcW w:type="dxa" w:w="427"/>
+            <w:tcW w:type="dxa" w:w="315"/>
             <w:gridSpan w:val="1"/>
             <w:tcBorders>
               <w:top w:val="single" w:color="000000" w:sz="4"/>
@@ -180,7 +180,7 @@
         </w:tc>
         <w:tc>
           <w:tcPr>
-            <w:tcW w:type="dxa" w:w="427"/>
+            <w:tcW w:type="dxa" w:w="315"/>
             <w:gridSpan w:val="1"/>
             <w:tcBorders>
               <w:top w:val="single" w:color="000000" w:sz="4"/>
@@ -215,7 +215,7 @@
         </w:tc>
         <w:tc>
           <w:tcPr>
-            <w:tcW w:type="dxa" w:w="427"/>
+            <w:tcW w:type="dxa" w:w="315"/>
             <w:gridSpan w:val="1"/>
             <w:tcBorders>
               <w:top w:val="single" w:color="000000" w:sz="4"/>
@@ -250,7 +250,7 @@
         </w:tc>
         <w:tc>
           <w:tcPr>
-            <w:tcW w:type="dxa" w:w="427"/>
+            <w:tcW w:type="dxa" w:w="315"/>
             <w:gridSpan w:val="1"/>
             <w:tcBorders>
               <w:top w:val="single" w:color="000000" w:sz="4"/>
@@ -285,7 +285,7 @@
         </w:tc>
         <w:tc>
           <w:tcPr>
-            <w:tcW w:type="dxa" w:w="427"/>
+            <w:tcW w:type="dxa" w:w="315"/>
             <w:gridSpan w:val="1"/>
             <w:tcBorders>
               <w:top w:val="single" w:color="000000" w:sz="4"/>
@@ -320,7 +320,7 @@
         </w:tc>
         <w:tc>
           <w:tcPr>
-            <w:tcW w:type="dxa" w:w="427"/>
+            <w:tcW w:type="dxa" w:w="315"/>
             <w:gridSpan w:val="1"/>
             <w:tcBorders>
               <w:top w:val="single" w:color="000000" w:sz="4"/>
@@ -355,7 +355,7 @@
         </w:tc>
         <w:tc>
           <w:tcPr>
-            <w:tcW w:type="dxa" w:w="427"/>
+            <w:tcW w:type="dxa" w:w="315"/>
             <w:gridSpan w:val="1"/>
             <w:tcBorders>
               <w:top w:val="single" w:color="000000" w:sz="4"/>
@@ -390,7 +390,7 @@
         </w:tc>
         <w:tc>
           <w:tcPr>
-            <w:tcW w:type="dxa" w:w="427"/>
+            <w:tcW w:type="dxa" w:w="315"/>
             <w:gridSpan w:val="1"/>
             <w:tcBorders>
               <w:top w:val="single" w:color="000000" w:sz="4"/>
@@ -425,7 +425,7 @@
         </w:tc>
         <w:tc>
           <w:tcPr>
-            <w:tcW w:type="dxa" w:w="427"/>
+            <w:tcW w:type="dxa" w:w="315"/>
             <w:gridSpan w:val="1"/>
             <w:tcBorders>
               <w:top w:val="single" w:color="000000" w:sz="4"/>
@@ -467,7 +467,7 @@
     </w:p>
     <w:tbl>
       <w:tblPr>
-        <w:tblW w:type="dxa" w:w="14640"/>
+        <w:tblW w:type="dxa" w:w="10800"/>
         <w:tblBorders>
           <w:top w:val="single" w:color="auto" w:sz="4"/>
           <w:left w:val="single" w:color="auto" w:sz="4"/>
@@ -478,12 +478,12 @@
         </w:tblBorders>
       </w:tblPr>
       <w:tblGrid>
-        <w:gridCol w:w="14640"/>
+        <w:gridCol w:w="10800"/>
       </w:tblGrid>
       <w:tr>
         <w:tc>
           <w:tcPr>
-            <w:tcW w:type="dxa" w:w="14640"/>
+            <w:tcW w:type="dxa" w:w="10800"/>
             <w:gridSpan w:val="1"/>
             <w:tcBorders>
               <w:top w:val="single" w:color="000000" w:sz="4"/>
@@ -501,7 +501,7 @@
           </w:tcPr>
           <w:tbl>
             <w:tblPr>
-              <w:tblW w:type="dxa" w:w="14640"/>
+              <w:tblW w:type="dxa" w:w="10800"/>
               <w:tblBorders>
                 <w:top w:val="single" w:color="auto" w:sz="4"/>
                 <w:left w:val="single" w:color="auto" w:sz="4"/>
@@ -512,13 +512,13 @@
               </w:tblBorders>
             </w:tblPr>
             <w:tblGrid>
-              <w:gridCol w:w="9647"/>
-              <w:gridCol w:w="4993"/>
+              <w:gridCol w:w="7117"/>
+              <w:gridCol w:w="3683"/>
             </w:tblGrid>
             <w:tr>
               <w:tc>
                 <w:tcPr>
-                  <w:tcW w:type="dxa" w:w="9647"/>
+                  <w:tcW w:type="dxa" w:w="7117"/>
                   <w:gridSpan w:val="1"/>
                   <w:tcBorders>
                     <w:top w:val="single" w:color="000000" w:sz="4"/>
@@ -554,7 +554,7 @@
               </w:tc>
               <w:tc>
                 <w:tcPr>
-                  <w:tcW w:type="dxa" w:w="4993"/>
+                  <w:tcW w:type="dxa" w:w="3683"/>
                   <w:gridSpan w:val="1"/>
                   <w:tcBorders>
                     <w:top w:val="single" w:color="000000" w:sz="4"/>
@@ -592,7 +592,7 @@
             <w:tr>
               <w:tc>
                 <w:tcPr>
-                  <w:tcW w:type="dxa" w:w="9647"/>
+                  <w:tcW w:type="dxa" w:w="7117"/>
                   <w:gridSpan w:val="1"/>
                   <w:tcBorders>
                     <w:top w:val="single" w:color="000000" w:sz="4"/>
@@ -610,7 +610,7 @@
                 </w:tcPr>
                 <w:tbl>
                   <w:tblPr>
-                    <w:tblW w:type="dxa" w:w="9353"/>
+                    <w:tblW w:type="dxa" w:w="6900"/>
                     <w:tblBorders>
                       <w:top w:val="single" w:color="auto" w:sz="4"/>
                       <w:left w:val="single" w:color="auto" w:sz="4"/>
@@ -621,32 +621,32 @@
                     </w:tblBorders>
                   </w:tblPr>
                   <w:tblGrid>
-                    <w:gridCol w:w="445"/>
-                    <w:gridCol w:w="445"/>
-                    <w:gridCol w:w="445"/>
-                    <w:gridCol w:w="445"/>
-                    <w:gridCol w:w="445"/>
-                    <w:gridCol w:w="445"/>
-                    <w:gridCol w:w="445"/>
-                    <w:gridCol w:w="445"/>
-                    <w:gridCol w:w="445"/>
-                    <w:gridCol w:w="445"/>
-                    <w:gridCol w:w="445"/>
-                    <w:gridCol w:w="445"/>
-                    <w:gridCol w:w="445"/>
-                    <w:gridCol w:w="445"/>
-                    <w:gridCol w:w="445"/>
-                    <w:gridCol w:w="445"/>
-                    <w:gridCol w:w="445"/>
-                    <w:gridCol w:w="445"/>
-                    <w:gridCol w:w="445"/>
-                    <w:gridCol w:w="445"/>
-                    <w:gridCol w:w="445"/>
+                    <w:gridCol w:w="328"/>
+                    <w:gridCol w:w="328"/>
+                    <w:gridCol w:w="328"/>
+                    <w:gridCol w:w="328"/>
+                    <w:gridCol w:w="328"/>
+                    <w:gridCol w:w="328"/>
+                    <w:gridCol w:w="328"/>
+                    <w:gridCol w:w="328"/>
+                    <w:gridCol w:w="328"/>
+                    <w:gridCol w:w="328"/>
+                    <w:gridCol w:w="328"/>
+                    <w:gridCol w:w="328"/>
+                    <w:gridCol w:w="328"/>
+                    <w:gridCol w:w="328"/>
+                    <w:gridCol w:w="328"/>
+                    <w:gridCol w:w="328"/>
+                    <w:gridCol w:w="328"/>
+                    <w:gridCol w:w="328"/>
+                    <w:gridCol w:w="328"/>
+                    <w:gridCol w:w="328"/>
+                    <w:gridCol w:w="328"/>
                   </w:tblGrid>
                   <w:tr>
                     <w:tc>
                       <w:tcPr>
-                        <w:tcW w:type="dxa" w:w="445"/>
+                        <w:tcW w:type="dxa" w:w="328"/>
                         <w:gridSpan w:val="1"/>
                         <w:tcBorders>
                           <w:top w:val="single" w:color="000000" w:sz="4"/>
@@ -681,7 +681,7 @@
                     </w:tc>
                     <w:tc>
                       <w:tcPr>
-                        <w:tcW w:type="dxa" w:w="445"/>
+                        <w:tcW w:type="dxa" w:w="328"/>
                         <w:gridSpan w:val="1"/>
                         <w:tcBorders>
                           <w:top w:val="single" w:color="000000" w:sz="4"/>
@@ -716,7 +716,7 @@
                     </w:tc>
                     <w:tc>
                       <w:tcPr>
-                        <w:tcW w:type="dxa" w:w="445"/>
+                        <w:tcW w:type="dxa" w:w="328"/>
                         <w:gridSpan w:val="1"/>
                         <w:tcBorders>
                           <w:top w:val="single" w:color="000000" w:sz="4"/>
@@ -751,7 +751,7 @@
                     </w:tc>
                     <w:tc>
                       <w:tcPr>
-                        <w:tcW w:type="dxa" w:w="445"/>
+                        <w:tcW w:type="dxa" w:w="328"/>
                         <w:gridSpan w:val="1"/>
                         <w:tcBorders>
                           <w:top w:val="single" w:color="000000" w:sz="4"/>
@@ -786,7 +786,7 @@
                     </w:tc>
                     <w:tc>
                       <w:tcPr>
-                        <w:tcW w:type="dxa" w:w="445"/>
+                        <w:tcW w:type="dxa" w:w="328"/>
                         <w:gridSpan w:val="1"/>
                         <w:tcBorders>
                           <w:top w:val="single" w:color="000000" w:sz="4"/>
@@ -821,7 +821,7 @@
                     </w:tc>
                     <w:tc>
                       <w:tcPr>
-                        <w:tcW w:type="dxa" w:w="445"/>
+                        <w:tcW w:type="dxa" w:w="328"/>
                         <w:gridSpan w:val="1"/>
                         <w:tcBorders>
                           <w:top w:val="single" w:color="000000" w:sz="4"/>
@@ -856,7 +856,7 @@
                     </w:tc>
                     <w:tc>
                       <w:tcPr>
-                        <w:tcW w:type="dxa" w:w="445"/>
+                        <w:tcW w:type="dxa" w:w="328"/>
                         <w:gridSpan w:val="1"/>
                         <w:tcBorders>
                           <w:top w:val="single" w:color="000000" w:sz="4"/>
@@ -891,7 +891,7 @@
                     </w:tc>
                     <w:tc>
                       <w:tcPr>
-                        <w:tcW w:type="dxa" w:w="445"/>
+                        <w:tcW w:type="dxa" w:w="328"/>
                         <w:gridSpan w:val="1"/>
                         <w:tcBorders>
                           <w:top w:val="single" w:color="000000" w:sz="4"/>
@@ -926,7 +926,7 @@
                     </w:tc>
                     <w:tc>
                       <w:tcPr>
-                        <w:tcW w:type="dxa" w:w="445"/>
+                        <w:tcW w:type="dxa" w:w="328"/>
                         <w:gridSpan w:val="1"/>
                         <w:tcBorders>
                           <w:top w:val="single" w:color="000000" w:sz="4"/>
@@ -961,7 +961,7 @@
                     </w:tc>
                     <w:tc>
                       <w:tcPr>
-                        <w:tcW w:type="dxa" w:w="445"/>
+                        <w:tcW w:type="dxa" w:w="328"/>
                         <w:gridSpan w:val="1"/>
                         <w:tcBorders>
                           <w:top w:val="single" w:color="000000" w:sz="4"/>
@@ -996,7 +996,7 @@
                     </w:tc>
                     <w:tc>
                       <w:tcPr>
-                        <w:tcW w:type="dxa" w:w="445"/>
+                        <w:tcW w:type="dxa" w:w="328"/>
                         <w:gridSpan w:val="1"/>
                         <w:tcBorders>
                           <w:top w:val="single" w:color="000000" w:sz="4"/>
@@ -1031,7 +1031,7 @@
                     </w:tc>
                     <w:tc>
                       <w:tcPr>
-                        <w:tcW w:type="dxa" w:w="445"/>
+                        <w:tcW w:type="dxa" w:w="328"/>
                         <w:gridSpan w:val="1"/>
                         <w:tcBorders>
                           <w:top w:val="single" w:color="000000" w:sz="4"/>
@@ -1066,7 +1066,7 @@
                     </w:tc>
                     <w:tc>
                       <w:tcPr>
-                        <w:tcW w:type="dxa" w:w="445"/>
+                        <w:tcW w:type="dxa" w:w="328"/>
                         <w:gridSpan w:val="1"/>
                         <w:tcBorders>
                           <w:top w:val="single" w:color="000000" w:sz="4"/>
@@ -1101,7 +1101,7 @@
                     </w:tc>
                     <w:tc>
                       <w:tcPr>
-                        <w:tcW w:type="dxa" w:w="445"/>
+                        <w:tcW w:type="dxa" w:w="328"/>
                         <w:gridSpan w:val="1"/>
                         <w:tcBorders>
                           <w:top w:val="single" w:color="000000" w:sz="4"/>
@@ -1136,7 +1136,7 @@
                     </w:tc>
                     <w:tc>
                       <w:tcPr>
-                        <w:tcW w:type="dxa" w:w="445"/>
+                        <w:tcW w:type="dxa" w:w="328"/>
                         <w:gridSpan w:val="1"/>
                         <w:tcBorders>
                           <w:top w:val="single" w:color="000000" w:sz="4"/>
@@ -1171,7 +1171,7 @@
                     </w:tc>
                     <w:tc>
                       <w:tcPr>
-                        <w:tcW w:type="dxa" w:w="445"/>
+                        <w:tcW w:type="dxa" w:w="328"/>
                         <w:gridSpan w:val="1"/>
                         <w:tcBorders>
                           <w:top w:val="single" w:color="000000" w:sz="4"/>
@@ -1206,7 +1206,7 @@
                     </w:tc>
                     <w:tc>
                       <w:tcPr>
-                        <w:tcW w:type="dxa" w:w="445"/>
+                        <w:tcW w:type="dxa" w:w="328"/>
                         <w:gridSpan w:val="1"/>
                         <w:tcBorders>
                           <w:top w:val="single" w:color="000000" w:sz="4"/>
@@ -1241,7 +1241,7 @@
                     </w:tc>
                     <w:tc>
                       <w:tcPr>
-                        <w:tcW w:type="dxa" w:w="445"/>
+                        <w:tcW w:type="dxa" w:w="328"/>
                         <w:gridSpan w:val="1"/>
                         <w:tcBorders>
                           <w:top w:val="single" w:color="000000" w:sz="4"/>
@@ -1276,7 +1276,7 @@
                     </w:tc>
                     <w:tc>
                       <w:tcPr>
-                        <w:tcW w:type="dxa" w:w="445"/>
+                        <w:tcW w:type="dxa" w:w="328"/>
                         <w:gridSpan w:val="1"/>
                         <w:tcBorders>
                           <w:top w:val="single" w:color="000000" w:sz="4"/>
@@ -1311,7 +1311,7 @@
                     </w:tc>
                     <w:tc>
                       <w:tcPr>
-                        <w:tcW w:type="dxa" w:w="445"/>
+                        <w:tcW w:type="dxa" w:w="328"/>
                         <w:gridSpan w:val="1"/>
                         <w:tcBorders>
                           <w:top w:val="single" w:color="000000" w:sz="4"/>
@@ -1346,7 +1346,7 @@
                     </w:tc>
                     <w:tc>
                       <w:tcPr>
-                        <w:tcW w:type="dxa" w:w="445"/>
+                        <w:tcW w:type="dxa" w:w="328"/>
                         <w:gridSpan w:val="1"/>
                         <w:tcBorders>
                           <w:top w:val="single" w:color="000000" w:sz="4"/>
@@ -1383,7 +1383,7 @@
                   <w:tr>
                     <w:tc>
                       <w:tcPr>
-                        <w:tcW w:type="dxa" w:w="889"/>
+                        <w:tcW w:type="dxa" w:w="656"/>
                         <w:gridSpan w:val="2"/>
                         <w:tcBorders>
                           <w:top w:val="single" w:color="000000" w:sz="4"/>
@@ -1417,7 +1417,7 @@
                     </w:tc>
                     <w:tc>
                       <w:tcPr>
-                        <w:tcW w:type="dxa" w:w="1334"/>
+                        <w:tcW w:type="dxa" w:w="984"/>
                         <w:gridSpan w:val="3"/>
                         <w:tcBorders>
                           <w:top w:val="single" w:color="000000" w:sz="4"/>
@@ -1451,7 +1451,7 @@
                     </w:tc>
                     <w:tc>
                       <w:tcPr>
-                        <w:tcW w:type="dxa" w:w="889"/>
+                        <w:tcW w:type="dxa" w:w="656"/>
                         <w:gridSpan w:val="2"/>
                         <w:tcBorders>
                           <w:top w:val="single" w:color="000000" w:sz="4"/>
@@ -1485,7 +1485,7 @@
                     </w:tc>
                     <w:tc>
                       <w:tcPr>
-                        <w:tcW w:type="dxa" w:w="2223"/>
+                        <w:tcW w:type="dxa" w:w="1640"/>
                         <w:gridSpan w:val="5"/>
                         <w:tcBorders>
                           <w:top w:val="single" w:color="000000" w:sz="4"/>
@@ -1519,7 +1519,7 @@
                     </w:tc>
                     <w:tc>
                       <w:tcPr>
-                        <w:tcW w:type="dxa" w:w="1778"/>
+                        <w:tcW w:type="dxa" w:w="1312"/>
                         <w:gridSpan w:val="4"/>
                         <w:tcBorders>
                           <w:top w:val="single" w:color="000000" w:sz="4"/>
@@ -1553,7 +1553,7 @@
                     </w:tc>
                     <w:tc>
                       <w:tcPr>
-                        <w:tcW w:type="dxa" w:w="2223"/>
+                        <w:tcW w:type="dxa" w:w="1640"/>
                         <w:gridSpan w:val="5"/>
                         <w:tcBorders>
                           <w:top w:val="single" w:color="000000" w:sz="4"/>
@@ -1606,7 +1606,7 @@
               </w:tc>
               <w:tc>
                 <w:tcPr>
-                  <w:tcW w:type="dxa" w:w="4993"/>
+                  <w:tcW w:type="dxa" w:w="3683"/>
                   <w:gridSpan w:val="1"/>
                   <w:tcBorders>
                     <w:top w:val="single" w:color="000000" w:sz="4"/>
@@ -1624,7 +1624,7 @@
                 </w:tcPr>
                 <w:tbl>
                   <w:tblPr>
-                    <w:tblW w:type="dxa" w:w="4744"/>
+                    <w:tblW w:type="dxa" w:w="3500"/>
                     <w:tblBorders>
                       <w:top w:val="single" w:color="auto" w:sz="4"/>
                       <w:left w:val="single" w:color="auto" w:sz="4"/>
@@ -1635,23 +1635,23 @@
                     </w:tblBorders>
                   </w:tblPr>
                   <w:tblGrid>
-                    <w:gridCol w:w="394"/>
-                    <w:gridCol w:w="394"/>
-                    <w:gridCol w:w="394"/>
-                    <w:gridCol w:w="394"/>
-                    <w:gridCol w:w="394"/>
-                    <w:gridCol w:w="394"/>
-                    <w:gridCol w:w="394"/>
-                    <w:gridCol w:w="394"/>
-                    <w:gridCol w:w="394"/>
-                    <w:gridCol w:w="394"/>
-                    <w:gridCol w:w="394"/>
-                    <w:gridCol w:w="394"/>
+                    <w:gridCol w:w="291"/>
+                    <w:gridCol w:w="291"/>
+                    <w:gridCol w:w="291"/>
+                    <w:gridCol w:w="291"/>
+                    <w:gridCol w:w="291"/>
+                    <w:gridCol w:w="291"/>
+                    <w:gridCol w:w="291"/>
+                    <w:gridCol w:w="291"/>
+                    <w:gridCol w:w="291"/>
+                    <w:gridCol w:w="291"/>
+                    <w:gridCol w:w="291"/>
+                    <w:gridCol w:w="291"/>
                   </w:tblGrid>
                   <w:tr>
                     <w:tc>
                       <w:tcPr>
-                        <w:tcW w:type="dxa" w:w="394"/>
+                        <w:tcW w:type="dxa" w:w="291"/>
                         <w:gridSpan w:val="1"/>
                         <w:tcBorders>
                           <w:top w:val="single" w:color="000000" w:sz="4"/>
@@ -1686,7 +1686,7 @@
                     </w:tc>
                     <w:tc>
                       <w:tcPr>
-                        <w:tcW w:type="dxa" w:w="394"/>
+                        <w:tcW w:type="dxa" w:w="291"/>
                         <w:gridSpan w:val="1"/>
                         <w:tcBorders>
                           <w:top w:val="single" w:color="000000" w:sz="4"/>
@@ -1721,7 +1721,7 @@
                     </w:tc>
                     <w:tc>
                       <w:tcPr>
-                        <w:tcW w:type="dxa" w:w="394"/>
+                        <w:tcW w:type="dxa" w:w="291"/>
                         <w:gridSpan w:val="1"/>
                         <w:tcBorders>
                           <w:top w:val="single" w:color="000000" w:sz="4"/>
@@ -1756,7 +1756,7 @@
                     </w:tc>
                     <w:tc>
                       <w:tcPr>
-                        <w:tcW w:type="dxa" w:w="394"/>
+                        <w:tcW w:type="dxa" w:w="291"/>
                         <w:gridSpan w:val="1"/>
                         <w:tcBorders>
                           <w:top w:val="single" w:color="000000" w:sz="4"/>
@@ -1791,7 +1791,7 @@
                     </w:tc>
                     <w:tc>
                       <w:tcPr>
-                        <w:tcW w:type="dxa" w:w="394"/>
+                        <w:tcW w:type="dxa" w:w="291"/>
                         <w:gridSpan w:val="1"/>
                         <w:tcBorders>
                           <w:top w:val="single" w:color="000000" w:sz="4"/>
@@ -1826,7 +1826,7 @@
                     </w:tc>
                     <w:tc>
                       <w:tcPr>
-                        <w:tcW w:type="dxa" w:w="394"/>
+                        <w:tcW w:type="dxa" w:w="291"/>
                         <w:gridSpan w:val="1"/>
                         <w:tcBorders>
                           <w:top w:val="single" w:color="000000" w:sz="4"/>
@@ -1861,7 +1861,7 @@
                     </w:tc>
                     <w:tc>
                       <w:tcPr>
-                        <w:tcW w:type="dxa" w:w="394"/>
+                        <w:tcW w:type="dxa" w:w="291"/>
                         <w:gridSpan w:val="1"/>
                         <w:tcBorders>
                           <w:top w:val="single" w:color="000000" w:sz="4"/>
@@ -1896,7 +1896,7 @@
                     </w:tc>
                     <w:tc>
                       <w:tcPr>
-                        <w:tcW w:type="dxa" w:w="394"/>
+                        <w:tcW w:type="dxa" w:w="291"/>
                         <w:gridSpan w:val="1"/>
                         <w:tcBorders>
                           <w:top w:val="single" w:color="000000" w:sz="4"/>
@@ -1931,7 +1931,7 @@
                     </w:tc>
                     <w:tc>
                       <w:tcPr>
-                        <w:tcW w:type="dxa" w:w="394"/>
+                        <w:tcW w:type="dxa" w:w="291"/>
                         <w:gridSpan w:val="1"/>
                         <w:tcBorders>
                           <w:top w:val="single" w:color="000000" w:sz="4"/>
@@ -1966,7 +1966,7 @@
                     </w:tc>
                     <w:tc>
                       <w:tcPr>
-                        <w:tcW w:type="dxa" w:w="394"/>
+                        <w:tcW w:type="dxa" w:w="291"/>
                         <w:gridSpan w:val="1"/>
                         <w:tcBorders>
                           <w:top w:val="single" w:color="000000" w:sz="4"/>
@@ -2001,7 +2001,7 @@
                     </w:tc>
                     <w:tc>
                       <w:tcPr>
-                        <w:tcW w:type="dxa" w:w="394"/>
+                        <w:tcW w:type="dxa" w:w="291"/>
                         <w:gridSpan w:val="1"/>
                         <w:tcBorders>
                           <w:top w:val="single" w:color="000000" w:sz="4"/>
@@ -2036,7 +2036,7 @@
                     </w:tc>
                     <w:tc>
                       <w:tcPr>
-                        <w:tcW w:type="dxa" w:w="394"/>
+                        <w:tcW w:type="dxa" w:w="291"/>
                         <w:gridSpan w:val="1"/>
                         <w:tcBorders>
                           <w:top w:val="single" w:color="000000" w:sz="4"/>
@@ -2096,7 +2096,7 @@
       <w:tr>
         <w:tc>
           <w:tcPr>
-            <w:tcW w:type="dxa" w:w="14640"/>
+            <w:tcW w:type="dxa" w:w="10800"/>
             <w:gridSpan w:val="1"/>
             <w:tcBorders>
               <w:top w:val="single" w:color="000000" w:sz="4"/>
@@ -2114,7 +2114,7 @@
           </w:tcPr>
           <w:tbl>
             <w:tblPr>
-              <w:tblW w:type="dxa" w:w="14640"/>
+              <w:tblW w:type="dxa" w:w="10800"/>
               <w:tblBorders>
                 <w:top w:val="single" w:color="auto" w:sz="4"/>
                 <w:left w:val="single" w:color="auto" w:sz="4"/>
@@ -2125,14 +2125,14 @@
               </w:tblBorders>
             </w:tblPr>
             <w:tblGrid>
-              <w:gridCol w:w="1956"/>
-              <w:gridCol w:w="7958"/>
-              <w:gridCol w:w="4725"/>
+              <w:gridCol w:w="1443"/>
+              <w:gridCol w:w="5871"/>
+              <w:gridCol w:w="3486"/>
             </w:tblGrid>
             <w:tr>
               <w:tc>
                 <w:tcPr>
-                  <w:tcW w:type="dxa" w:w="1956"/>
+                  <w:tcW w:type="dxa" w:w="1443"/>
                   <w:gridSpan w:val="1"/>
                   <w:tcBorders>
                     <w:top w:val="single" w:color="000000" w:sz="4"/>
@@ -2168,7 +2168,7 @@
               </w:tc>
               <w:tc>
                 <w:tcPr>
-                  <w:tcW w:type="dxa" w:w="12684"/>
+                  <w:tcW w:type="dxa" w:w="9357"/>
                   <w:gridSpan w:val="2"/>
                   <w:tcBorders>
                     <w:top w:val="single" w:color="000000" w:sz="4"/>
@@ -2209,7 +2209,7 @@
               </w:trPr>
               <w:tc>
                 <w:tcPr>
-                  <w:tcW w:type="dxa" w:w="1956"/>
+                  <w:tcW w:type="dxa" w:w="1443"/>
                   <w:gridSpan w:val="1"/>
                   <w:tcBorders>
                     <w:top w:val="none" w:color="FFFFFF" w:sz="0"/>
@@ -2227,7 +2227,7 @@
                 </w:tcPr>
                 <w:tbl>
                   <w:tblPr>
-                    <w:tblW w:type="dxa" w:w="1956"/>
+                    <w:tblW w:type="dxa" w:w="1443"/>
                     <w:tblBorders>
                       <w:top w:val="single" w:color="auto" w:sz="4"/>
                       <w:left w:val="single" w:color="auto" w:sz="4"/>
@@ -2238,7 +2238,7 @@
                     </w:tblBorders>
                   </w:tblPr>
                   <w:tblGrid>
-                    <w:gridCol w:w="1956"/>
+                    <w:gridCol w:w="1443"/>
                   </w:tblGrid>
                   <w:tr>
                     <w:trPr>
@@ -2246,7 +2246,7 @@
                     </w:trPr>
                     <w:tc>
                       <w:tcPr>
-                        <w:tcW w:type="dxa" w:w="1956"/>
+                        <w:tcW w:type="dxa" w:w="1443"/>
                         <w:gridSpan w:val="1"/>
                         <w:tcBorders>
                           <w:top w:val="single" w:color="000000" w:sz="4"/>
@@ -2302,7 +2302,7 @@
                     </w:trPr>
                     <w:tc>
                       <w:tcPr>
-                        <w:tcW w:type="dxa" w:w="1956"/>
+                        <w:tcW w:type="dxa" w:w="1443"/>
                         <w:gridSpan w:val="1"/>
                         <w:tcBorders>
                           <w:top w:val="single" w:color="000000" w:sz="4"/>
@@ -2357,7 +2357,7 @@
               </w:tc>
               <w:tc>
                 <w:tcPr>
-                  <w:tcW w:type="dxa" w:w="7958"/>
+                  <w:tcW w:type="dxa" w:w="5871"/>
                   <w:gridSpan w:val="1"/>
                   <w:tcBorders>
                     <w:top w:val="single" w:color="000000" w:sz="4"/>
@@ -2409,7 +2409,7 @@
               </w:tc>
               <w:tc>
                 <w:tcPr>
-                  <w:tcW w:type="dxa" w:w="4725"/>
+                  <w:tcW w:type="dxa" w:w="3486"/>
                   <w:gridSpan w:val="1"/>
                   <w:tcBorders>
                     <w:top w:val="single" w:color="000000" w:sz="4"/>
@@ -2466,7 +2466,7 @@
       <w:tr>
         <w:tc>
           <w:tcPr>
-            <w:tcW w:type="dxa" w:w="14640"/>
+            <w:tcW w:type="dxa" w:w="10800"/>
             <w:gridSpan w:val="1"/>
             <w:tcBorders>
               <w:top w:val="single" w:color="000000" w:sz="4"/>
@@ -2507,7 +2507,7 @@
         </w:trPr>
         <w:tc>
           <w:tcPr>
-            <w:tcW w:type="dxa" w:w="14640"/>
+            <w:tcW w:type="dxa" w:w="10800"/>
             <w:gridSpan w:val="1"/>
             <w:tcBorders>
               <w:top w:val="single" w:color="000000" w:sz="4"/>
@@ -2544,7 +2544,7 @@
       <w:tr>
         <w:tc>
           <w:tcPr>
-            <w:tcW w:type="dxa" w:w="14640"/>
+            <w:tcW w:type="dxa" w:w="10800"/>
             <w:gridSpan w:val="1"/>
             <w:tcBorders>
               <w:top w:val="single" w:color="000000" w:sz="4"/>
@@ -2582,7 +2582,7 @@
       <w:tr>
         <w:tc>
           <w:tcPr>
-            <w:tcW w:type="dxa" w:w="14640"/>
+            <w:tcW w:type="dxa" w:w="10800"/>
             <w:gridSpan w:val="1"/>
             <w:tcBorders>
               <w:top w:val="single" w:color="000000" w:sz="4"/>
@@ -2600,7 +2600,7 @@
           </w:tcPr>
           <w:tbl>
             <w:tblPr>
-              <w:tblW w:type="dxa" w:w="14640"/>
+              <w:tblW w:type="dxa" w:w="10800"/>
               <w:tblBorders>
                 <w:top w:val="single" w:color="auto" w:sz="4"/>
                 <w:left w:val="single" w:color="auto" w:sz="4"/>
@@ -2611,16 +2611,16 @@
               </w:tblBorders>
             </w:tblPr>
             <w:tblGrid>
-              <w:gridCol w:w="4923"/>
-              <w:gridCol w:w="2294"/>
-              <w:gridCol w:w="2024"/>
-              <w:gridCol w:w="2024"/>
-              <w:gridCol w:w="3375"/>
+              <w:gridCol w:w="3632"/>
+              <w:gridCol w:w="1692"/>
+              <w:gridCol w:w="1493"/>
+              <w:gridCol w:w="1493"/>
+              <w:gridCol w:w="2490"/>
             </w:tblGrid>
             <w:tr>
               <w:tc>
                 <w:tcPr>
-                  <w:tcW w:type="dxa" w:w="4923"/>
+                  <w:tcW w:type="dxa" w:w="3632"/>
                   <w:gridSpan w:val="1"/>
                   <w:tcBorders>
                     <w:top w:val="single" w:color="000000" w:sz="4"/>
@@ -2655,7 +2655,7 @@
               </w:tc>
               <w:tc>
                 <w:tcPr>
-                  <w:tcW w:type="dxa" w:w="2294"/>
+                  <w:tcW w:type="dxa" w:w="1692"/>
                   <w:gridSpan w:val="1"/>
                   <w:tcBorders>
                     <w:top w:val="single" w:color="000000" w:sz="4"/>
@@ -2690,7 +2690,7 @@
               </w:tc>
               <w:tc>
                 <w:tcPr>
-                  <w:tcW w:type="dxa" w:w="2024"/>
+                  <w:tcW w:type="dxa" w:w="1493"/>
                   <w:gridSpan w:val="1"/>
                   <w:tcBorders>
                     <w:top w:val="single" w:color="000000" w:sz="4"/>
@@ -2725,7 +2725,7 @@
               </w:tc>
               <w:tc>
                 <w:tcPr>
-                  <w:tcW w:type="dxa" w:w="2024"/>
+                  <w:tcW w:type="dxa" w:w="1493"/>
                   <w:gridSpan w:val="1"/>
                   <w:tcBorders>
                     <w:top w:val="single" w:color="000000" w:sz="4"/>
@@ -2760,7 +2760,7 @@
               </w:tc>
               <w:tc>
                 <w:tcPr>
-                  <w:tcW w:type="dxa" w:w="3375"/>
+                  <w:tcW w:type="dxa" w:w="2490"/>
                   <w:gridSpan w:val="1"/>
                   <w:tcBorders>
                     <w:top w:val="single" w:color="000000" w:sz="4"/>
@@ -2800,7 +2800,7 @@
               </w:trPr>
               <w:tc>
                 <w:tcPr>
-                  <w:tcW w:type="dxa" w:w="4923"/>
+                  <w:tcW w:type="dxa" w:w="3632"/>
                   <w:gridSpan w:val="1"/>
                   <w:tcBorders>
                     <w:top w:val="single" w:color="000000" w:sz="4"/>
@@ -2835,7 +2835,7 @@
               </w:tc>
               <w:tc>
                 <w:tcPr>
-                  <w:tcW w:type="dxa" w:w="2294"/>
+                  <w:tcW w:type="dxa" w:w="1692"/>
                   <w:gridSpan w:val="1"/>
                   <w:tcBorders>
                     <w:top w:val="single" w:color="000000" w:sz="4"/>
@@ -2870,7 +2870,7 @@
               </w:tc>
               <w:tc>
                 <w:tcPr>
-                  <w:tcW w:type="dxa" w:w="2024"/>
+                  <w:tcW w:type="dxa" w:w="1493"/>
                   <w:gridSpan w:val="1"/>
                   <w:tcBorders>
                     <w:top w:val="single" w:color="000000" w:sz="4"/>
@@ -2905,7 +2905,7 @@
               </w:tc>
               <w:tc>
                 <w:tcPr>
-                  <w:tcW w:type="dxa" w:w="2024"/>
+                  <w:tcW w:type="dxa" w:w="1493"/>
                   <w:gridSpan w:val="1"/>
                   <w:tcBorders>
                     <w:top w:val="single" w:color="000000" w:sz="4"/>
@@ -2940,7 +2940,7 @@
               </w:tc>
               <w:tc>
                 <w:tcPr>
-                  <w:tcW w:type="dxa" w:w="3375"/>
+                  <w:tcW w:type="dxa" w:w="2490"/>
                   <w:gridSpan w:val="1"/>
                   <w:tcBorders>
                     <w:top w:val="single" w:color="000000" w:sz="4"/>
@@ -3029,8 +3029,8 @@
       </w:r>
     </w:p>
     <w:sectPr>
-      <w:pgSz w:w="15840" w:h="12240" w:orient="landscape"/>
-      <w:pgMar w:top="500" w:right="600" w:bottom="500" w:left="600" w:header="708" w:footer="708" w:gutter="0"/>
+      <w:pgSz w:w="12240" w:h="15840" w:orient="portrait"/>
+      <w:pgMar w:top="720" w:right="720" w:bottom="720" w:left="720" w:header="708" w:footer="708" w:gutter="0"/>
       <w:pgNumType/>
       <w:docGrid w:linePitch="360"/>
     </w:sectPr>

</xml_diff>